<commit_message>
[Farras] Initialize project - backend
</commit_message>
<xml_diff>
--- a/backend/app/templates/docx/D01_HPS.docx
+++ b/backend/app/templates/docx/D01_HPS.docx
@@ -15,6 +15,18 @@
           <w:sz w:val="17"/>
         </w:rPr>
         <w:t>{{ draft_banner }}</w:t>
+      </w:r>
+    </w:p>
+    <w:p>
+      <w:pPr>
+        <w:spacing w:before="0" w:after="80"/>
+        <w:jc w:val="center"/>
+      </w:pPr>
+      <w:r>
+        <w:rPr>
+          <w:rFonts w:ascii="Arial" w:hAnsi="Arial"/>
+        </w:rPr>
+        <w:t>{% if school_has_letterhead_image %}{{ school_letterhead_image }}{% else %}</w:t>
       </w:r>
     </w:p>
     <w:p>
@@ -62,11 +74,12 @@
       </w:pPr>
       <w:r>
         <w:rPr>
+          <w:rFonts w:ascii="Arial" w:hAnsi="Arial"/>
           <w:b/>
           <w:color w:val="1A365D"/>
           <w:sz w:val="19"/>
         </w:rPr>
-        <w:t>====================================================================</w:t>
+        <w:t>===================================================================={% endif %}</w:t>
       </w:r>
     </w:p>
     <w:p>
@@ -131,8 +144,8 @@
         </w:trPr>
         <w:tc>
           <w:tcPr>
-            <w:tcW w:type="dxa" w:w="648"/>
-            <w:tcW w:w="648" w:type="dxa"/>
+            <w:tcW w:type="dxa" w:w="504"/>
+            <w:tcW w:w="503" w:type="dxa"/>
             <w:tcMar>
               <w:top w:w="120" w:type="dxa"/>
               <w:bottom w:w="120" w:type="dxa"/>
@@ -157,8 +170,8 @@
         </w:tc>
         <w:tc>
           <w:tcPr>
-            <w:tcW w:type="dxa" w:w="3672"/>
-            <w:tcW w:w="3671" w:type="dxa"/>
+            <w:tcW w:type="dxa" w:w="3816"/>
+            <w:tcW w:w="3816" w:type="dxa"/>
             <w:tcMar>
               <w:top w:w="120" w:type="dxa"/>
               <w:bottom w:w="120" w:type="dxa"/>
@@ -335,8 +348,8 @@
         </w:trPr>
         <w:tc>
           <w:tcPr>
-            <w:tcW w:type="dxa" w:w="648"/>
-            <w:tcW w:w="648" w:type="dxa"/>
+            <w:tcW w:type="dxa" w:w="504"/>
+            <w:tcW w:w="503" w:type="dxa"/>
             <w:tcMar>
               <w:top w:w="90" w:type="dxa"/>
               <w:bottom w:w="90" w:type="dxa"/>
@@ -359,8 +372,8 @@
         </w:tc>
         <w:tc>
           <w:tcPr>
-            <w:tcW w:type="dxa" w:w="3672"/>
-            <w:tcW w:w="3671" w:type="dxa"/>
+            <w:tcW w:type="dxa" w:w="3816"/>
+            <w:tcW w:w="3816" w:type="dxa"/>
             <w:tcMar>
               <w:top w:w="90" w:type="dxa"/>
               <w:bottom w:w="90" w:type="dxa"/>
@@ -686,6 +699,7 @@
     </w:tbl>
     <w:p>
       <w:pPr>
+        <w:keepNext/>
         <w:spacing w:before="120" w:after="240"/>
       </w:pPr>
       <w:r>
@@ -722,6 +736,9 @@
         <w:gridCol w:w="5040"/>
       </w:tblGrid>
       <w:tr>
+        <w:trPr>
+          <w:cantSplit/>
+        </w:trPr>
         <w:tc>
           <w:tcPr>
             <w:tcW w:type="dxa" w:w="4824"/>
@@ -735,10 +752,14 @@
           </w:tcPr>
           <w:p>
             <w:pPr>
+              <w:keepNext/>
               <w:spacing w:line="288" w:lineRule="auto"/>
               <w:jc w:val="center"/>
             </w:pPr>
             <w:r>
+              <w:rPr>
+                <w:rFonts w:ascii="Arial" w:hAnsi="Arial"/>
+              </w:rPr>
               <w:t>Mengetahui,</w:t>
               <w:br/>
               <w:t>Kepala Sekolah</w:t>
@@ -750,6 +771,7 @@
             </w:r>
             <w:r>
               <w:rPr>
+                <w:rFonts w:ascii="Arial" w:hAnsi="Arial"/>
                 <w:b/>
                 <w:u w:val="single"/>
               </w:rPr>
@@ -757,6 +779,9 @@
               <w:br/>
             </w:r>
             <w:r>
+              <w:rPr>
+                <w:rFonts w:ascii="Arial" w:hAnsi="Arial"/>
+              </w:rPr>
               <w:t>NIP: {{ school.principal_nip }}</w:t>
             </w:r>
           </w:p>
@@ -774,10 +799,14 @@
           </w:tcPr>
           <w:p>
             <w:pPr>
+              <w:keepNext/>
               <w:spacing w:line="288" w:lineRule="auto"/>
               <w:jc w:val="center"/>
             </w:pPr>
             <w:r>
+              <w:rPr>
+                <w:rFonts w:ascii="Arial" w:hAnsi="Arial"/>
+              </w:rPr>
               <w:t>Jakarta, {{ events.HPS.date_id }}</w:t>
               <w:br/>
               <w:t>Pejabat Pengadaan,</w:t>
@@ -791,6 +820,7 @@
             </w:r>
             <w:r>
               <w:rPr>
+                <w:rFonts w:ascii="Arial" w:hAnsi="Arial"/>
                 <w:b/>
                 <w:u w:val="single"/>
               </w:rPr>
@@ -798,6 +828,9 @@
               <w:br/>
             </w:r>
             <w:r>
+              <w:rPr>
+                <w:rFonts w:ascii="Arial" w:hAnsi="Arial"/>
+              </w:rPr>
               <w:t>NIP: {{ officials.pejabat_pengadaan.nip }}</w:t>
             </w:r>
           </w:p>
@@ -1177,6 +1210,10 @@
     <w:name w:val="Normal"/>
     <w:qFormat/>
     <w:rsid w:val="00FC693F"/>
+    <w:rPr>
+      <w:rFonts w:ascii="Arial" w:hAnsi="Arial"/>
+      <w:sz w:val="19"/>
+    </w:rPr>
   </w:style>
   <w:style w:type="paragraph" w:styleId="Header">
     <w:name w:val="header"/>

</xml_diff>